<commit_message>
Follow-ups done (F1 replicates, F2 no rescue); final report + presentation complete
- results/H4.md §9, FINDINGS.md, H2_H3.md updated with F1/F2
- report/FINAL_REPORT.{md,pdf,docx}, report/LTH_Warmup_Final.pptx (rebuild: bash report/build.sh)
- analysis/h4_tables.py lists the follow-ups

Co-Authored-By: Claude Opus 5.5 <noreply@anthropic.com>
</commit_message>
<xml_diff>
--- a/report/FINAL_REPORT.docx
+++ b/report/FINAL_REPORT.docx
@@ -320,6 +320,25 @@
       </w:r>
       <w:r>
         <w:t xml:space="preserve"> </w:t>
+      </w:r>
+      <w:r>
+        <w:t xml:space="preserve">The result replicates on a second seed, and the reverse test confirms it: the masks found without warmup still fail when trained</w:t>
+      </w:r>
+      <w:r>
+        <w:t xml:space="preserve"> </w:t>
+      </w:r>
+      <w:r>
+        <w:rPr>
+          <w:iCs/>
+          <w:i/>
+        </w:rPr>
+        <w:t xml:space="preserve">with</w:t>
+      </w:r>
+      <w:r>
+        <w:t xml:space="preserve"> </w:t>
+      </w:r>
+      <w:r>
+        <w:t xml:space="preserve">warmup.</w:t>
       </w:r>
       <w:r>
         <w:t xml:space="preserve"> </w:t>
@@ -1438,25 +1457,13 @@
         <w:t xml:space="preserve"> </w:t>
       </w:r>
       <w:r>
-        <w:t xml:space="preserve">Seeds 0 and 1 for low, high and warm03; seed 0 for high_warm and H4; 141 trainings in all</w:t>
-      </w:r>
-      <w:r>
-        <w:t xml:space="preserve">,</w:t>
-      </w:r>
-      <w:r>
-        <w:t xml:space="preserve"> </w:t>
-      </w:r>
-      <w:r>
-        <w:t xml:space="preserve">on one NVIDIA T4 (Colab), three processes in parallel under CUDA MPS. Total ≈</w:t>
-      </w:r>
-      <w:r>
-        <w:t xml:space="preserve"> </w:t>
-      </w:r>
-      <w:r>
-        <w:t xml:space="preserve"> </w:t>
-      </w:r>
-      <w:r>
-        <w:t xml:space="preserve">of a 30-hour budget.</w:t>
+        <w:t xml:space="preserve">Seeds 0 and 1 for low, high and warm03; seed 0 for high_warm and H4, plus two pre-registered follow-ups (H4(a) on seed 1, and a reverse swap; §4.5); 137 trainings in all (including 2 short runs that chose the anchor strength),</w:t>
+      </w:r>
+      <w:r>
+        <w:t xml:space="preserve"> </w:t>
+      </w:r>
+      <w:r>
+        <w:t xml:space="preserve">on one NVIDIA T4 (Colab), three processes in parallel under CUDA MPS. Total ≈ 26 hours of a 30-hour runtime budget.</w:t>
       </w:r>
     </w:p>
     <w:bookmarkEnd w:id="23"/>
@@ -3069,7 +3076,7 @@
           <wp:inline>
             <wp:extent cx="5334000" cy="3259970"/>
             <wp:effectExtent b="0" l="0" r="0" t="0"/>
-            <wp:docPr descr="Figure 3. Ticket − shuffle advantage on warm03’s three masks, trained at η = 0.1 without warmup. Dashed line: the pre-registered +2.0 pp rescue bar." title="" id="34" name="Picture"/>
+            <wp:docPr descr="Figure 3. Ticket − shuffle advantage on warm03’s three masks, trained at η = 0.1 without warmup. Dashed line: the pre-registered +2.0 pp rescue bar. Open circles: (a) repeated on seed 1 (F1, §4.5)." title="" id="34" name="Picture"/>
             <a:graphic>
               <a:graphicData uri="http://schemas.openxmlformats.org/drawingml/2006/picture">
                 <pic:pic>
@@ -3112,7 +3119,7 @@
         <w:pStyle w:val="ImageCaption"/>
       </w:pPr>
       <w:r>
-        <w:t xml:space="preserve">Figure 3. Ticket − shuffle advantage on warm03’s three masks, trained at η = 0.1 without warmup. Dashed line: the pre-registered +2.0 pp rescue bar.</w:t>
+        <w:t xml:space="preserve">Figure 3. Ticket − shuffle advantage on warm03’s three masks, trained at η = 0.1 without warmup. Dashed line: the pre-registered +2.0 pp rescue bar. Open circles: (a) repeated on seed 1 (F1, §4.5).</w:t>
       </w:r>
     </w:p>
     <w:p>
@@ -3642,9 +3649,9 @@
       <w:r>
         <w:drawing>
           <wp:inline>
-            <wp:extent cx="5334000" cy="2939092"/>
+            <wp:extent cx="5334000" cy="2934190"/>
             <wp:effectExtent b="0" l="0" r="0" t="0"/>
-            <wp:docPr descr="Figure 4. Ticket accuracy on three masks under the same training. The mask decides." title="" id="37" name="Picture"/>
+            <wp:docPr descr="Figure 4. Ticket accuracy on three masks under the same training. The green and orange lines differ only in the mask (same θ₀, η = 0.1, no warmup); the orange and violet lines differ only in warmup (F2, §4.5). The mask decides." title="" id="37" name="Picture"/>
             <a:graphic>
               <a:graphicData uri="http://schemas.openxmlformats.org/drawingml/2006/picture">
                 <pic:pic>
@@ -3663,7 +3670,7 @@
                   <pic:spPr bwMode="auto">
                     <a:xfrm>
                       <a:off x="0" y="0"/>
-                      <a:ext cx="5334000" cy="2939092"/>
+                      <a:ext cx="5334000" cy="2934190"/>
                     </a:xfrm>
                     <a:prstGeom prst="rect">
                       <a:avLst/>
@@ -3687,7 +3694,7 @@
         <w:pStyle w:val="ImageCaption"/>
       </w:pPr>
       <w:r>
-        <w:t xml:space="preserve">Figure 4. Ticket accuracy on three masks under the same training. The mask decides.</w:t>
+        <w:t xml:space="preserve">Figure 4. Ticket accuracy on three masks under the same training. The green and orange lines differ only in the mask (same θ₀, η = 0.1, no warmup); the orange and violet lines differ only in warmup (F2, §4.5). The mask decides.</w:t>
       </w:r>
     </w:p>
     <w:p>
@@ -3844,6 +3851,503 @@
       </w:r>
       <w:r>
         <w:t xml:space="preserve">(same code, same +2.0 pp rule) before seeing their results.</w:t>
+      </w:r>
+    </w:p>
+    <w:p>
+      <w:pPr>
+        <w:pStyle w:val="TableCaption"/>
+      </w:pPr>
+      <w:r>
+        <w:t xml:space="preserve">Table 3. Ticket − baseline advantage (pp) in the follow-up runs. F1 uses warm03 seed 1’s masks and θ₀; F2 uses high’s seed-0 masks and the high_warm schedule. The high-chain row is from Phase A (reinit at 12.0%, shuffle at 6.0%).</w:t>
+      </w:r>
+    </w:p>
+    <w:tbl>
+      <w:tblPr>
+        <w:tblStyle w:val="Table"/>
+        <w:tblW w:type="pct" w:w="5000"/>
+        <w:tblLook w:firstRow="1" w:lastRow="0" w:firstColumn="0" w:lastColumn="0" w:noHBand="0" w:noVBand="0" w:val="0020"/>
+        <w:jc w:val="start"/>
+        <w:tblCaption w:val="Table 3. Ticket − baseline advantage (pp) in the follow-up runs. F1 uses warm03 seed 1’s masks and θ₀; F2 uses high’s seed-0 masks and the high_warm schedule. The high-chain row is from Phase A (reinit at 12.0%, shuffle at 6.0%)."/>
+      </w:tblPr>
+      <w:tblGrid>
+        <w:gridCol w:w="4281"/>
+        <w:gridCol w:w="856"/>
+        <w:gridCol w:w="856"/>
+        <w:gridCol w:w="856"/>
+        <w:gridCol w:w="1070"/>
+      </w:tblGrid>
+      <w:tr>
+        <w:trPr>
+          <w:tblHeader w:val="true"/>
+        </w:trPr>
+        <w:tc>
+          <w:tcPr/>
+          <w:p>
+            <w:pPr>
+              <w:pStyle w:val="Compact"/>
+              <w:jc w:val="left"/>
+            </w:pPr>
+            <w:r>
+              <w:t xml:space="preserve">Run</w:t>
+            </w:r>
+          </w:p>
+        </w:tc>
+        <w:tc>
+          <w:tcPr/>
+          <w:p>
+            <w:pPr>
+              <w:pStyle w:val="Compact"/>
+              <w:jc w:val="left"/>
+            </w:pPr>
+            <w:r>
+              <w:t xml:space="preserve">34.5%</w:t>
+            </w:r>
+          </w:p>
+        </w:tc>
+        <w:tc>
+          <w:tcPr/>
+          <w:p>
+            <w:pPr>
+              <w:pStyle w:val="Compact"/>
+              <w:jc w:val="left"/>
+            </w:pPr>
+            <w:r>
+              <w:t xml:space="preserve">12.0%</w:t>
+            </w:r>
+          </w:p>
+        </w:tc>
+        <w:tc>
+          <w:tcPr/>
+          <w:p>
+            <w:pPr>
+              <w:pStyle w:val="Compact"/>
+              <w:jc w:val="left"/>
+            </w:pPr>
+            <w:r>
+              <w:t xml:space="preserve">6.0%</w:t>
+            </w:r>
+          </w:p>
+        </w:tc>
+        <w:tc>
+          <w:tcPr/>
+          <w:p>
+            <w:pPr>
+              <w:pStyle w:val="Compact"/>
+              <w:jc w:val="left"/>
+            </w:pPr>
+            <w:r>
+              <w:t xml:space="preserve">Masks ≥ +2.0 pp</w:t>
+            </w:r>
+          </w:p>
+        </w:tc>
+      </w:tr>
+      <w:tr>
+        <w:tc>
+          <w:tcPr/>
+          <w:p>
+            <w:pPr>
+              <w:pStyle w:val="Compact"/>
+              <w:jc w:val="left"/>
+            </w:pPr>
+            <w:r>
+              <w:t xml:space="preserve">(a) seed 0 · warm03 masks, η 0.1</w:t>
+            </w:r>
+          </w:p>
+        </w:tc>
+        <w:tc>
+          <w:tcPr/>
+          <w:p>
+            <w:pPr>
+              <w:pStyle w:val="Compact"/>
+              <w:jc w:val="left"/>
+            </w:pPr>
+            <w:r>
+              <w:t xml:space="preserve">+0.89</w:t>
+            </w:r>
+          </w:p>
+        </w:tc>
+        <w:tc>
+          <w:tcPr/>
+          <w:p>
+            <w:pPr>
+              <w:pStyle w:val="Compact"/>
+              <w:jc w:val="left"/>
+            </w:pPr>
+            <w:r>
+              <w:t xml:space="preserve">+3.59</w:t>
+            </w:r>
+          </w:p>
+        </w:tc>
+        <w:tc>
+          <w:tcPr/>
+          <w:p>
+            <w:pPr>
+              <w:pStyle w:val="Compact"/>
+              <w:jc w:val="left"/>
+            </w:pPr>
+            <w:r>
+              <w:t xml:space="preserve">+4.80</w:t>
+            </w:r>
+          </w:p>
+        </w:tc>
+        <w:tc>
+          <w:tcPr/>
+          <w:p>
+            <w:pPr>
+              <w:pStyle w:val="Compact"/>
+              <w:jc w:val="left"/>
+            </w:pPr>
+            <w:r>
+              <w:t xml:space="preserve">2 / 3</w:t>
+            </w:r>
+          </w:p>
+        </w:tc>
+      </w:tr>
+      <w:tr>
+        <w:tc>
+          <w:tcPr/>
+          <w:p>
+            <w:pPr>
+              <w:pStyle w:val="Compact"/>
+              <w:jc w:val="left"/>
+            </w:pPr>
+            <w:r>
+              <w:rPr>
+                <w:bCs/>
+                <w:b/>
+              </w:rPr>
+              <w:t xml:space="preserve">F1</w:t>
+            </w:r>
+            <w:r>
+              <w:t xml:space="preserve"> </w:t>
+            </w:r>
+            <w:r>
+              <w:t xml:space="preserve">· the same on seed 1</w:t>
+            </w:r>
+          </w:p>
+        </w:tc>
+        <w:tc>
+          <w:tcPr/>
+          <w:p>
+            <w:pPr>
+              <w:pStyle w:val="Compact"/>
+              <w:jc w:val="left"/>
+            </w:pPr>
+            <w:r>
+              <w:t xml:space="preserve">+0.93</w:t>
+            </w:r>
+          </w:p>
+        </w:tc>
+        <w:tc>
+          <w:tcPr/>
+          <w:p>
+            <w:pPr>
+              <w:pStyle w:val="Compact"/>
+              <w:jc w:val="left"/>
+            </w:pPr>
+            <w:r>
+              <w:rPr>
+                <w:bCs/>
+                <w:b/>
+              </w:rPr>
+              <w:t xml:space="preserve">+3.54</w:t>
+            </w:r>
+          </w:p>
+        </w:tc>
+        <w:tc>
+          <w:tcPr/>
+          <w:p>
+            <w:pPr>
+              <w:pStyle w:val="Compact"/>
+              <w:jc w:val="left"/>
+            </w:pPr>
+            <w:r>
+              <w:rPr>
+                <w:bCs/>
+                <w:b/>
+              </w:rPr>
+              <w:t xml:space="preserve">+4.40</w:t>
+            </w:r>
+          </w:p>
+        </w:tc>
+        <w:tc>
+          <w:tcPr/>
+          <w:p>
+            <w:pPr>
+              <w:pStyle w:val="Compact"/>
+              <w:jc w:val="left"/>
+            </w:pPr>
+            <w:r>
+              <w:rPr>
+                <w:bCs/>
+                <w:b/>
+              </w:rPr>
+              <w:t xml:space="preserve">2 / 3</w:t>
+            </w:r>
+          </w:p>
+        </w:tc>
+      </w:tr>
+      <w:tr>
+        <w:tc>
+          <w:tcPr/>
+          <w:p>
+            <w:pPr>
+              <w:pStyle w:val="Compact"/>
+              <w:jc w:val="left"/>
+            </w:pPr>
+            <w:r>
+              <w:t xml:space="preserve">high chain · its own masks, η 0.1</w:t>
+            </w:r>
+          </w:p>
+        </w:tc>
+        <w:tc>
+          <w:tcPr/>
+          <w:p>
+            <w:pPr>
+              <w:pStyle w:val="Compact"/>
+              <w:jc w:val="left"/>
+            </w:pPr>
+            <w:r>
+              <w:t xml:space="preserve">—</w:t>
+            </w:r>
+          </w:p>
+        </w:tc>
+        <w:tc>
+          <w:tcPr/>
+          <w:p>
+            <w:pPr>
+              <w:pStyle w:val="Compact"/>
+              <w:jc w:val="left"/>
+            </w:pPr>
+            <w:r>
+              <w:t xml:space="preserve">+0.39</w:t>
+            </w:r>
+          </w:p>
+        </w:tc>
+        <w:tc>
+          <w:tcPr/>
+          <w:p>
+            <w:pPr>
+              <w:pStyle w:val="Compact"/>
+              <w:jc w:val="left"/>
+            </w:pPr>
+            <w:r>
+              <w:t xml:space="preserve">+0.57</w:t>
+            </w:r>
+          </w:p>
+        </w:tc>
+        <w:tc>
+          <w:tcPr/>
+          <w:p>
+            <w:pPr>
+              <w:pStyle w:val="Compact"/>
+              <w:jc w:val="left"/>
+            </w:pPr>
+            <w:r>
+              <w:t xml:space="preserve">0 / 2</w:t>
+            </w:r>
+          </w:p>
+        </w:tc>
+      </w:tr>
+      <w:tr>
+        <w:tc>
+          <w:tcPr/>
+          <w:p>
+            <w:pPr>
+              <w:pStyle w:val="Compact"/>
+              <w:jc w:val="left"/>
+            </w:pPr>
+            <w:r>
+              <w:rPr>
+                <w:bCs/>
+                <w:b/>
+              </w:rPr>
+              <w:t xml:space="preserve">F2</w:t>
+            </w:r>
+            <w:r>
+              <w:t xml:space="preserve"> </w:t>
+            </w:r>
+            <w:r>
+              <w:t xml:space="preserve">· high’s masks, η 0.1</w:t>
+            </w:r>
+            <w:r>
+              <w:t xml:space="preserve"> </w:t>
+            </w:r>
+            <w:r>
+              <w:rPr>
+                <w:bCs/>
+                <w:b/>
+              </w:rPr>
+              <w:t xml:space="preserve">+ warmup</w:t>
+            </w:r>
+          </w:p>
+        </w:tc>
+        <w:tc>
+          <w:tcPr/>
+          <w:p>
+            <w:pPr>
+              <w:pStyle w:val="Compact"/>
+              <w:jc w:val="left"/>
+            </w:pPr>
+            <w:r>
+              <w:t xml:space="preserve">−0.02</w:t>
+            </w:r>
+          </w:p>
+        </w:tc>
+        <w:tc>
+          <w:tcPr/>
+          <w:p>
+            <w:pPr>
+              <w:pStyle w:val="Compact"/>
+              <w:jc w:val="left"/>
+            </w:pPr>
+            <w:r>
+              <w:t xml:space="preserve">+0.67</w:t>
+            </w:r>
+          </w:p>
+        </w:tc>
+        <w:tc>
+          <w:tcPr/>
+          <w:p>
+            <w:pPr>
+              <w:pStyle w:val="Compact"/>
+              <w:jc w:val="left"/>
+            </w:pPr>
+            <w:r>
+              <w:t xml:space="preserve">+0.31</w:t>
+            </w:r>
+          </w:p>
+        </w:tc>
+        <w:tc>
+          <w:tcPr/>
+          <w:p>
+            <w:pPr>
+              <w:pStyle w:val="Compact"/>
+              <w:jc w:val="left"/>
+            </w:pPr>
+            <w:r>
+              <w:rPr>
+                <w:bCs/>
+                <w:b/>
+              </w:rPr>
+              <w:t xml:space="preserve">0 / 3</w:t>
+            </w:r>
+          </w:p>
+        </w:tc>
+      </w:tr>
+    </w:tbl>
+    <w:p>
+      <w:pPr>
+        <w:pStyle w:val="BodyText"/>
+      </w:pPr>
+      <w:r>
+        <w:rPr>
+          <w:bCs/>
+          <w:b/>
+        </w:rPr>
+        <w:t xml:space="preserve">F1, replication: confirmed.</w:t>
+      </w:r>
+      <w:r>
+        <w:t xml:space="preserve"> </w:t>
+      </w:r>
+      <w:r>
+        <w:t xml:space="preserve">On an independent seed, warm03’s masks win at η = 0.1 without warmup at 2 of 3 masks, with advantages within</w:t>
+      </w:r>
+      <w:r>
+        <w:t xml:space="preserve"> </w:t>
+      </w:r>
+      <w:r>
+        <w:t xml:space="preserve">0.4 pp of seed 0 at every mask. As in seed 0, the early sharpness transient is present (max S 0.25–0.27) and R</w:t>
+      </w:r>
+      <w:r>
+        <w:rPr>
+          <w:vertAlign w:val="subscript"/>
+        </w:rPr>
+        <w:t xml:space="preserve">0.2</w:t>
+      </w:r>
+      <w:r>
+        <w:t xml:space="preserve"> </w:t>
+      </w:r>
+      <w:r>
+        <w:t xml:space="preserve">is at chance (0.18–0.20).</w:t>
+      </w:r>
+    </w:p>
+    <w:p>
+      <w:pPr>
+        <w:pStyle w:val="BodyText"/>
+      </w:pPr>
+      <w:r>
+        <w:rPr>
+          <w:bCs/>
+          <w:b/>
+        </w:rPr>
+        <w:t xml:space="preserve">F2, reverse swap: warmup does not rescue a bad mask.</w:t>
+      </w:r>
+      <w:r>
+        <w:t xml:space="preserve"> </w:t>
+      </w:r>
+      <w:r>
+        <w:t xml:space="preserve">high’s own masks, trained from the same θ₀ on the high_warm schedule, stay at or below</w:t>
+      </w:r>
+      <w:r>
+        <w:t xml:space="preserve"> </w:t>
+      </w:r>
+      <w:r>
+        <w:t xml:space="preserve">+0.7 pp, which is the failing chain’s level. Warmup did what it does elsewhere: it removed the early transient (max S 0.09–0.12, against</w:t>
+      </w:r>
+      <w:r>
+        <w:t xml:space="preserve"> </w:t>
+      </w:r>
+      <w:r>
+        <w:t xml:space="preserve">0.18–0.29 without warmup) and kept slightly more correlation (R</w:t>
+      </w:r>
+      <w:r>
+        <w:rPr>
+          <w:vertAlign w:val="subscript"/>
+        </w:rPr>
+        <w:t xml:space="preserve">0.2</w:t>
+      </w:r>
+      <w:r>
+        <w:t xml:space="preserve"> </w:t>
+      </w:r>
+      <w:r>
+        <w:t xml:space="preserve">0.25–0.28 vs 0.22–0.23). Yet the tickets were no better</w:t>
+      </w:r>
+      <w:r>
+        <w:t xml:space="preserve"> </w:t>
+      </w:r>
+      <w:r>
+        <w:t xml:space="preserve">(87.64 / 85.08 / 82.04% vs 88.36 / 85.52 / 82.72% without warmup).</w:t>
+      </w:r>
+    </w:p>
+    <w:p>
+      <w:pPr>
+        <w:pStyle w:val="BodyText"/>
+      </w:pPr>
+      <w:r>
+        <w:t xml:space="preserve">Together, with θ₀ and η = 0.1 held fixed,</w:t>
+      </w:r>
+      <w:r>
+        <w:t xml:space="preserve"> </w:t>
+      </w:r>
+      <w:r>
+        <w:rPr>
+          <w:bCs/>
+          <w:b/>
+        </w:rPr>
+        <w:t xml:space="preserve">a good mask wins without warmup, and a bad mask loses with it.</w:t>
+      </w:r>
+      <w:r>
+        <w:t xml:space="preserve"> </w:t>
+      </w:r>
+      <w:r>
+        <w:t xml:space="preserve">Warmup during training is neither</w:t>
+      </w:r>
+      <w:r>
+        <w:t xml:space="preserve"> </w:t>
+      </w:r>
+      <w:r>
+        <w:t xml:space="preserve">necessary for a good mask nor sufficient for a bad one.</w:t>
       </w:r>
     </w:p>
     <w:bookmarkEnd w:id="40"/>
@@ -3928,7 +4432,7 @@
         <w:t xml:space="preserve">found</w:t>
       </w:r>
       <w:r>
-        <w:t xml:space="preserve">.</w:t>
+        <w:t xml:space="preserve">. The reverse swap (F2) tests this directly: applying warmup only when the bad mask is trained, after the mask has been found, does not help.</w:t>
       </w:r>
     </w:p>
     <w:p>
@@ -3992,10 +4496,7 @@
         <w:t xml:space="preserve"> </w:t>
       </w:r>
       <w:r>
-        <w:t xml:space="preserve">Two seeds for the main conditions; one for high_warm and for SAM / anchor.</w:t>
-      </w:r>
-      <w:r>
-        <w:t xml:space="preserve"> </w:t>
+        <w:t xml:space="preserve">Two seeds for the main conditions; one for high_warm, SAM, the anchor and the reverse swap. The central H4(a) result holds on two seeds (F1).</w:t>
       </w:r>
     </w:p>
     <w:p>
@@ -4177,13 +4678,13 @@
         <w:t xml:space="preserve"> </w:t>
       </w:r>
       <w:r>
-        <w:t xml:space="preserve">exactly those training conditions, and directly lowering sharpness or raising correlation does not improve the ticket. The failure lies in the mask that</w:t>
-      </w:r>
-      <w:r>
-        <w:t xml:space="preserve"> </w:t>
-      </w:r>
-      <w:r>
-        <w:t xml:space="preserve">iterative magnitude pruning selects when the network is trained at a high learning rate.</w:t>
+        <w:t xml:space="preserve">exactly those training conditions (on two seeds), a bad mask still fails when warmup is added, and directly lowering sharpness or raising correlation</w:t>
+      </w:r>
+      <w:r>
+        <w:t xml:space="preserve"> </w:t>
+      </w:r>
+      <w:r>
+        <w:t xml:space="preserve">does not improve the ticket. The failure lies in the mask that iterative magnitude pruning selects when the network is trained at a high learning rate.</w:t>
       </w:r>
     </w:p>
     <w:bookmarkEnd w:id="43"/>

</xml_diff>

<commit_message>
Proofread final report and deck against results
- max S claim scoped (0.54 in pruning chains, 0.63 over all runs)
- IMP 'resets' (not rewinds) to θ0; cite He et al.; untested mechanism marked as such
- high-chain R_0.2 range 0.22–0.24; note different baselines in the warm03 comparison
- rewinding next step attributed correctly; uncited references removed; Paul et al. title fixed
- deck: same fixes, 'association' instead of 'correlation' on the H2 slide

Co-Authored-By: Claude Opus 5.5 <noreply@anthropic.com>
</commit_message>
<xml_diff>
--- a/report/FINAL_REPORT.docx
+++ b/report/FINAL_REPORT.docx
@@ -294,7 +294,7 @@
         <w:t xml:space="preserve"> </w:t>
       </w:r>
       <w:r>
-        <w:t xml:space="preserve">(max S = 0.54). In a pre-registered causal test, the good masks found with warmup, trained at η = 0.1 with no warmup,</w:t>
+        <w:t xml:space="preserve">(max S = 0.54 in the pruning chains, 0.63 over all 135 runs). In a pre-registered causal test, the good masks found with warmup, trained at η = 0.1 with no warmup,</w:t>
       </w:r>
       <w:r>
         <w:t xml:space="preserve"> </w:t>
@@ -322,7 +322,7 @@
         <w:t xml:space="preserve"> </w:t>
       </w:r>
       <w:r>
-        <w:t xml:space="preserve">The result replicates on a second seed, and the reverse test confirms it: the masks found without warmup still fail when trained</w:t>
+        <w:t xml:space="preserve">The result replicates on a second seed, and the reverse test confirms it: the masks found at η = 0.1 without warmup still fail when trained</w:t>
       </w:r>
       <w:r>
         <w:t xml:space="preserve"> </w:t>
@@ -400,7 +400,7 @@
         <w:t xml:space="preserve"> </w:t>
       </w:r>
       <w:r>
-        <w:t xml:space="preserve">magnitude pruning (IMP): train, prune the smallest weights, rewind the survivors to θ₀, repeat. On deeper networks (VGG-19, ResNet-18) this only</w:t>
+        <w:t xml:space="preserve">magnitude pruning (IMP): train, prune the smallest weights, reset the survivors to θ₀, repeat. On deeper networks (VGG-19, ResNet-18) this only</w:t>
       </w:r>
       <w:r>
         <w:t xml:space="preserve"> </w:t>
@@ -777,7 +777,7 @@
         <w:t xml:space="preserve"> </w:t>
       </w:r>
       <w:r>
-        <w:t xml:space="preserve">for reported numbers). Augmentation is random crop with 4-px padding and horizontal flip. The model is ResNet-20 (3 stages × 3 basic blocks,</w:t>
+        <w:t xml:space="preserve">for reported numbers). Augmentation is random crop with 4-px padding and horizontal flip. The model is ResNet-20 (He et al., 2016; 3 stages × 3 basic blocks,</w:t>
       </w:r>
       <w:r>
         <w:t xml:space="preserve"> </w:t>
@@ -2832,7 +2832,13 @@
         <w:t xml:space="preserve"> </w:t>
       </w:r>
       <w:r>
-        <w:t xml:space="preserve">Over 63 tickets and 42 baselines, the largest max S(25–3k) is 0.54. The failing high tickets peak at 0.16–0.54,</w:t>
+        <w:t xml:space="preserve">Over the 63 tickets (including the dense networks) and 42 baselines of the pruning chains, the largest max S(25–3k) is 0.54</w:t>
+      </w:r>
+      <w:r>
+        <w:t xml:space="preserve"> </w:t>
+      </w:r>
+      <w:r>
+        <w:t xml:space="preserve">(0.63 if the H4 runs are included). The failing high tickets peak at 0.16–0.54,</w:t>
       </w:r>
       <w:r>
         <w:t xml:space="preserve"> </w:t>
@@ -4311,7 +4317,7 @@
         <w:t xml:space="preserve"> </w:t>
       </w:r>
       <w:r>
-        <w:t xml:space="preserve">0.25–0.28 vs 0.22–0.23). Yet the tickets were no better</w:t>
+        <w:t xml:space="preserve">0.25–0.28 vs 0.22–0.24). Yet the tickets were no better</w:t>
       </w:r>
       <w:r>
         <w:t xml:space="preserve"> </w:t>
@@ -4407,13 +4413,13 @@
         <w:t xml:space="preserve">IMP’s selection of the mask</w:t>
       </w:r>
       <w:r>
-        <w:t xml:space="preserve">: the magnitudes after a high-learning-rate training run are a poor guide to which weights should</w:t>
-      </w:r>
-      <w:r>
-        <w:t xml:space="preserve"> </w:t>
-      </w:r>
-      <w:r>
-        <w:t xml:space="preserve">survive, and pruning on them compounds over rounds. This fits Paul et al. (2023), who show that an IMP mask encodes information about the training run that</w:t>
+        <w:t xml:space="preserve">. One explanation consistent with this, which we did not test, is that the weight magnitudes after a</w:t>
+      </w:r>
+      <w:r>
+        <w:t xml:space="preserve"> </w:t>
+      </w:r>
+      <w:r>
+        <w:t xml:space="preserve">high-learning-rate run are a poor guide to which weights should survive, and that the error compounds over pruning rounds. This fits Paul et al. (2023), who show that an IMP mask encodes information about the training run that</w:t>
       </w:r>
       <w:r>
         <w:t xml:space="preserve"> </w:t>
@@ -4432,7 +4438,13 @@
         <w:t xml:space="preserve">found</w:t>
       </w:r>
       <w:r>
-        <w:t xml:space="preserve">. The reverse swap (F2) tests this directly: applying warmup only when the bad mask is trained, after the mask has been found, does not help.</w:t>
+        <w:t xml:space="preserve">. The reverse swap (F2) supports this: applying warmup only when the bad mask is trained, after the mask has been found, does not help, while</w:t>
+      </w:r>
+      <w:r>
+        <w:t xml:space="preserve"> </w:t>
+      </w:r>
+      <w:r>
+        <w:t xml:space="preserve">high_warm, which uses warmup throughout IMP, finds winning masks.</w:t>
       </w:r>
     </w:p>
     <w:p>
@@ -4530,7 +4542,7 @@
         <w:t xml:space="preserve"> </w:t>
       </w:r>
       <w:r>
-        <w:t xml:space="preserve">(+3.59 vs +4.89 pp at 12.0%).</w:t>
+        <w:t xml:space="preserve">(+3.59 vs +4.89 pp at 12.0%, though against different baselines: shuffle in H4, reinit in the chain).</w:t>
       </w:r>
     </w:p>
     <w:p>
@@ -4642,13 +4654,13 @@
         <w:t xml:space="preserve"> </w:t>
       </w:r>
       <w:r>
-        <w:t xml:space="preserve">masks directly (layer-wise density, overlap) to find what distinguishes them. (3) Repeat with learning-rate rewinding (Frankle et al., 2020), which is known</w:t>
-      </w:r>
-      <w:r>
-        <w:t xml:space="preserve"> </w:t>
-      </w:r>
-      <w:r>
-        <w:t xml:space="preserve">to restore tickets at high rates and would test the mask-selection reading.</w:t>
+        <w:t xml:space="preserve">masks directly (layer-wise density, overlap) to find what distinguishes them. (3) Repeat with rewinding to an early training iteration instead of θ₀ (Frankle et al., 2020), which is known</w:t>
+      </w:r>
+      <w:r>
+        <w:t xml:space="preserve"> </w:t>
+      </w:r>
+      <w:r>
+        <w:t xml:space="preserve">to find tickets in deep networks at standard learning rates without warmup, and ask whether it works by producing better masks.</w:t>
       </w:r>
     </w:p>
     <w:bookmarkEnd w:id="42"/>
@@ -4856,7 +4868,7 @@
         <w:pStyle w:val="Compact"/>
       </w:pPr>
       <w:r>
-        <w:t xml:space="preserve">Lange, R. T., Sprekeler, H. (2023). Lottery tickets in evolutionary optimization: on sparse backpropagation-free trainability.</w:t>
+        <w:t xml:space="preserve">Liu, N., Yuan, G., et al. (2021). Lottery ticket preserves weight correlation: is it desirable or not?</w:t>
       </w:r>
       <w:r>
         <w:t xml:space="preserve"> </w:t>
@@ -4869,7 +4881,7 @@
         <w:t xml:space="preserve">ICML</w:t>
       </w:r>
       <w:r>
-        <w:t xml:space="preserve">. arXiv:2306.00045.</w:t>
+        <w:t xml:space="preserve">. arXiv:2102.11068.</w:t>
       </w:r>
     </w:p>
     <w:p>
@@ -4881,7 +4893,7 @@
         <w:pStyle w:val="Compact"/>
       </w:pPr>
       <w:r>
-        <w:t xml:space="preserve">Liu, N., Yuan, G., et al. (2021). Lottery ticket preserves weight correlation: is it desirable or not?</w:t>
+        <w:t xml:space="preserve">Paul, M., Chen, F., Larsen, B. W., Frankle, J., Ganguli, S., Dziugaite, G. K. (2023). Unmasking the lottery ticket hypothesis: what’s encoded in a winning ticket’s mask?</w:t>
       </w:r>
       <w:r>
         <w:t xml:space="preserve"> </w:t>
@@ -4891,60 +4903,10 @@
           <w:iCs/>
           <w:i/>
         </w:rPr>
-        <w:t xml:space="preserve">ICML</w:t>
-      </w:r>
-      <w:r>
-        <w:t xml:space="preserve">. arXiv:2102.11068.</w:t>
-      </w:r>
-    </w:p>
-    <w:p>
-      <w:pPr>
-        <w:numPr>
-          <w:ilvl w:val="0"/>
-          <w:numId w:val="1006"/>
-        </w:numPr>
-        <w:pStyle w:val="Compact"/>
-      </w:pPr>
-      <w:r>
-        <w:t xml:space="preserve">Paul, M., Chen, F., Larsen, B. W., Frankle, J., Ganguli, S., Dziugaite, G. K. (2023). Unmasking the lottery ticket hypothesis: what is encoded in a winning ticket’s mask?</w:t>
-      </w:r>
-      <w:r>
-        <w:t xml:space="preserve"> </w:t>
-      </w:r>
-      <w:r>
-        <w:rPr>
-          <w:iCs/>
-          <w:i/>
-        </w:rPr>
         <w:t xml:space="preserve">ICLR</w:t>
       </w:r>
       <w:r>
         <w:t xml:space="preserve">. arXiv:2210.03044.</w:t>
-      </w:r>
-    </w:p>
-    <w:p>
-      <w:pPr>
-        <w:numPr>
-          <w:ilvl w:val="0"/>
-          <w:numId w:val="1006"/>
-        </w:numPr>
-        <w:pStyle w:val="Compact"/>
-      </w:pPr>
-      <w:r>
-        <w:t xml:space="preserve">Sakamoto, K., Sato, I. (2022). Analyzing lottery ticket hypothesis from PAC-Bayesian theory perspective.</w:t>
-      </w:r>
-      <w:r>
-        <w:t xml:space="preserve"> </w:t>
-      </w:r>
-      <w:r>
-        <w:rPr>
-          <w:iCs/>
-          <w:i/>
-        </w:rPr>
-        <w:t xml:space="preserve">NeurIPS</w:t>
-      </w:r>
-      <w:r>
-        <w:t xml:space="preserve">. arXiv:2205.07320.</w:t>
       </w:r>
     </w:p>
     <w:bookmarkEnd w:id="44"/>

</xml_diff>